<commit_message>
Added Help cell in CV
</commit_message>
<xml_diff>
--- a/Cover Letter.docx
+++ b/Cover Letter.docx
@@ -191,21 +191,14 @@
           <w:sz w:val="24"/>
           <w:szCs w:val="24"/>
         </w:rPr>
-        <w:t>September</w:t>
-      </w:r>
-      <w:r>
-        <w:rPr>
-          <w:sz w:val="24"/>
-          <w:szCs w:val="24"/>
-        </w:rPr>
-        <w:t xml:space="preserve"> </w:t>
-      </w:r>
-      <w:r>
-        <w:rPr>
-          <w:sz w:val="24"/>
-          <w:szCs w:val="24"/>
-        </w:rPr>
-        <w:t>8</w:t>
+        <w:t>October 0</w:t>
+      </w:r>
+      <w:r>
+        <w:rPr>
+          <w:sz w:val="24"/>
+          <w:szCs w:val="24"/>
+        </w:rPr>
+        <w:t>4</w:t>
       </w:r>
       <w:r>
         <w:rPr>
@@ -378,37 +371,7 @@
           <w:szCs w:val="24"/>
           <w:lang w:val="en-IN" w:eastAsia="zh-CN" w:bidi="hi-IN"/>
         </w:rPr>
-        <w:t xml:space="preserve">I am currently pursuing B.Tech in Computer Science and MS by Research in Exact Humanities from International Institute of Information Technology (IIIT), Hyderabad, India. I am acquiring experience in coding, scripting and development in various languages </w:t>
-      </w:r>
-      <w:r>
-        <w:rPr>
-          <w:rFonts w:eastAsia="Noto Sans CJK SC Regular" w:cs="FreeSans"/>
-          <w:b w:val="false"/>
-          <w:i w:val="false"/>
-          <w:caps w:val="false"/>
-          <w:smallCaps w:val="false"/>
-          <w:color w:val="00000A"/>
-          <w:spacing w:val="0"/>
-          <w:sz w:val="24"/>
-          <w:szCs w:val="24"/>
-          <w:lang w:val="en-IN" w:eastAsia="zh-CN" w:bidi="hi-IN"/>
-        </w:rPr>
-        <w:t>along various basic Data Analytics.</w:t>
-      </w:r>
-      <w:r>
-        <w:rPr>
-          <w:rFonts w:eastAsia="Noto Sans CJK SC Regular" w:cs="FreeSans"/>
-          <w:b w:val="false"/>
-          <w:i w:val="false"/>
-          <w:caps w:val="false"/>
-          <w:smallCaps w:val="false"/>
-          <w:color w:val="00000A"/>
-          <w:spacing w:val="0"/>
-          <w:sz w:val="24"/>
-          <w:szCs w:val="24"/>
-          <w:lang w:val="en-IN" w:eastAsia="zh-CN" w:bidi="hi-IN"/>
-        </w:rPr>
-        <w:t xml:space="preserve"> </w:t>
+        <w:t xml:space="preserve">I am currently pursuing B.Tech in Computer Science and MS by Research in Exact Humanities from International Institute of Information Technology (IIIT), Hyderabad, India. I am acquiring experience in coding, scripting and development in various languages along various basic Data Analytics. </w:t>
       </w:r>
     </w:p>
     <w:p>
@@ -538,73 +501,117 @@
         </w:rPr>
       </w:pPr>
       <w:r>
-        <w:rPr/>
-      </w:r>
-    </w:p>
-    <w:p>
-      <w:pPr>
-        <w:pStyle w:val="Normal"/>
-        <w:rPr>
-          <w:rFonts w:eastAsia="Noto Sans CJK SC Regular" w:cs="FreeSans"/>
-          <w:b w:val="false"/>
-          <w:b w:val="false"/>
-          <w:i w:val="false"/>
-          <w:i w:val="false"/>
-          <w:caps w:val="false"/>
-          <w:smallCaps w:val="false"/>
-          <w:color w:val="00000A"/>
-          <w:spacing w:val="0"/>
-          <w:sz w:val="24"/>
-          <w:szCs w:val="24"/>
-          <w:lang w:val="en-IN" w:eastAsia="zh-CN" w:bidi="hi-IN"/>
-        </w:rPr>
-      </w:pPr>
-      <w:r>
-        <w:rPr/>
-      </w:r>
-    </w:p>
-    <w:p>
-      <w:pPr>
-        <w:pStyle w:val="Normal"/>
-        <w:rPr>
-          <w:rFonts w:eastAsia="Noto Sans CJK SC Regular" w:cs="FreeSans"/>
-          <w:b w:val="false"/>
-          <w:b w:val="false"/>
-          <w:i w:val="false"/>
-          <w:i w:val="false"/>
-          <w:caps w:val="false"/>
-          <w:smallCaps w:val="false"/>
-          <w:color w:val="00000A"/>
-          <w:spacing w:val="0"/>
-          <w:sz w:val="24"/>
-          <w:szCs w:val="24"/>
-          <w:lang w:val="en-IN" w:eastAsia="zh-CN" w:bidi="hi-IN"/>
-        </w:rPr>
-      </w:pPr>
-      <w:r>
-        <w:rPr/>
-      </w:r>
-    </w:p>
-    <w:p>
-      <w:pPr>
-        <w:pStyle w:val="Normal"/>
-        <w:rPr>
-          <w:rFonts w:eastAsia="Noto Sans CJK SC Regular" w:cs="FreeSans"/>
-          <w:b w:val="false"/>
-          <w:b w:val="false"/>
-          <w:i w:val="false"/>
-          <w:i w:val="false"/>
-          <w:caps w:val="false"/>
-          <w:smallCaps w:val="false"/>
-          <w:color w:val="00000A"/>
-          <w:spacing w:val="0"/>
-          <w:sz w:val="24"/>
-          <w:szCs w:val="24"/>
-          <w:lang w:val="en-IN" w:eastAsia="zh-CN" w:bidi="hi-IN"/>
-        </w:rPr>
-      </w:pPr>
-      <w:r>
-        <w:rPr/>
+        <w:rPr>
+          <w:rFonts w:eastAsia="Noto Sans CJK SC Regular" w:cs="FreeSans"/>
+          <w:b w:val="false"/>
+          <w:i w:val="false"/>
+          <w:caps w:val="false"/>
+          <w:smallCaps w:val="false"/>
+          <w:color w:val="00000A"/>
+          <w:spacing w:val="0"/>
+          <w:sz w:val="24"/>
+          <w:szCs w:val="24"/>
+          <w:lang w:val="en-IN" w:eastAsia="zh-CN" w:bidi="hi-IN"/>
+        </w:rPr>
+      </w:r>
+    </w:p>
+    <w:p>
+      <w:pPr>
+        <w:pStyle w:val="Normal"/>
+        <w:rPr>
+          <w:rFonts w:eastAsia="Noto Sans CJK SC Regular" w:cs="FreeSans"/>
+          <w:b w:val="false"/>
+          <w:b w:val="false"/>
+          <w:i w:val="false"/>
+          <w:i w:val="false"/>
+          <w:caps w:val="false"/>
+          <w:smallCaps w:val="false"/>
+          <w:color w:val="00000A"/>
+          <w:spacing w:val="0"/>
+          <w:sz w:val="24"/>
+          <w:szCs w:val="24"/>
+          <w:lang w:val="en-IN" w:eastAsia="zh-CN" w:bidi="hi-IN"/>
+        </w:rPr>
+      </w:pPr>
+      <w:r>
+        <w:rPr>
+          <w:rFonts w:eastAsia="Noto Sans CJK SC Regular" w:cs="FreeSans"/>
+          <w:b w:val="false"/>
+          <w:i w:val="false"/>
+          <w:caps w:val="false"/>
+          <w:smallCaps w:val="false"/>
+          <w:color w:val="00000A"/>
+          <w:spacing w:val="0"/>
+          <w:sz w:val="24"/>
+          <w:szCs w:val="24"/>
+          <w:lang w:val="en-IN" w:eastAsia="zh-CN" w:bidi="hi-IN"/>
+        </w:rPr>
+      </w:r>
+    </w:p>
+    <w:p>
+      <w:pPr>
+        <w:pStyle w:val="Normal"/>
+        <w:rPr>
+          <w:rFonts w:eastAsia="Noto Sans CJK SC Regular" w:cs="FreeSans"/>
+          <w:b w:val="false"/>
+          <w:b w:val="false"/>
+          <w:i w:val="false"/>
+          <w:i w:val="false"/>
+          <w:caps w:val="false"/>
+          <w:smallCaps w:val="false"/>
+          <w:color w:val="00000A"/>
+          <w:spacing w:val="0"/>
+          <w:sz w:val="24"/>
+          <w:szCs w:val="24"/>
+          <w:lang w:val="en-IN" w:eastAsia="zh-CN" w:bidi="hi-IN"/>
+        </w:rPr>
+      </w:pPr>
+      <w:r>
+        <w:rPr>
+          <w:rFonts w:eastAsia="Noto Sans CJK SC Regular" w:cs="FreeSans"/>
+          <w:b w:val="false"/>
+          <w:i w:val="false"/>
+          <w:caps w:val="false"/>
+          <w:smallCaps w:val="false"/>
+          <w:color w:val="00000A"/>
+          <w:spacing w:val="0"/>
+          <w:sz w:val="24"/>
+          <w:szCs w:val="24"/>
+          <w:lang w:val="en-IN" w:eastAsia="zh-CN" w:bidi="hi-IN"/>
+        </w:rPr>
+      </w:r>
+    </w:p>
+    <w:p>
+      <w:pPr>
+        <w:pStyle w:val="Normal"/>
+        <w:rPr>
+          <w:rFonts w:eastAsia="Noto Sans CJK SC Regular" w:cs="FreeSans"/>
+          <w:b w:val="false"/>
+          <w:b w:val="false"/>
+          <w:i w:val="false"/>
+          <w:i w:val="false"/>
+          <w:caps w:val="false"/>
+          <w:smallCaps w:val="false"/>
+          <w:color w:val="00000A"/>
+          <w:spacing w:val="0"/>
+          <w:sz w:val="24"/>
+          <w:szCs w:val="24"/>
+          <w:lang w:val="en-IN" w:eastAsia="zh-CN" w:bidi="hi-IN"/>
+        </w:rPr>
+      </w:pPr>
+      <w:r>
+        <w:rPr>
+          <w:rFonts w:eastAsia="Noto Sans CJK SC Regular" w:cs="FreeSans"/>
+          <w:b w:val="false"/>
+          <w:i w:val="false"/>
+          <w:caps w:val="false"/>
+          <w:smallCaps w:val="false"/>
+          <w:color w:val="00000A"/>
+          <w:spacing w:val="0"/>
+          <w:sz w:val="24"/>
+          <w:szCs w:val="24"/>
+          <w:lang w:val="en-IN" w:eastAsia="zh-CN" w:bidi="hi-IN"/>
+        </w:rPr>
       </w:r>
     </w:p>
     <w:p>
@@ -690,51 +697,84 @@
         </w:rPr>
       </w:pPr>
       <w:r>
-        <w:rPr/>
-      </w:r>
-    </w:p>
-    <w:p>
-      <w:pPr>
-        <w:pStyle w:val="Normal"/>
-        <w:rPr>
-          <w:rFonts w:eastAsia="Noto Sans CJK SC Regular" w:cs="FreeSans"/>
-          <w:b w:val="false"/>
-          <w:b w:val="false"/>
-          <w:i w:val="false"/>
-          <w:i w:val="false"/>
-          <w:caps w:val="false"/>
-          <w:smallCaps w:val="false"/>
-          <w:color w:val="00000A"/>
-          <w:spacing w:val="0"/>
-          <w:sz w:val="24"/>
-          <w:szCs w:val="24"/>
-          <w:lang w:val="en-IN" w:eastAsia="zh-CN" w:bidi="hi-IN"/>
-        </w:rPr>
-      </w:pPr>
-      <w:r>
-        <w:rPr/>
-      </w:r>
-    </w:p>
-    <w:p>
-      <w:pPr>
-        <w:pStyle w:val="Normal"/>
-        <w:rPr>
-          <w:rFonts w:eastAsia="Noto Sans CJK SC Regular" w:cs="FreeSans"/>
-          <w:b w:val="false"/>
-          <w:b w:val="false"/>
-          <w:i w:val="false"/>
-          <w:i w:val="false"/>
-          <w:caps w:val="false"/>
-          <w:smallCaps w:val="false"/>
-          <w:color w:val="00000A"/>
-          <w:spacing w:val="0"/>
-          <w:sz w:val="24"/>
-          <w:szCs w:val="24"/>
-          <w:lang w:val="en-IN" w:eastAsia="zh-CN" w:bidi="hi-IN"/>
-        </w:rPr>
-      </w:pPr>
-      <w:r>
-        <w:rPr/>
+        <w:rPr>
+          <w:rFonts w:eastAsia="Noto Sans CJK SC Regular" w:cs="FreeSans"/>
+          <w:b w:val="false"/>
+          <w:i w:val="false"/>
+          <w:caps w:val="false"/>
+          <w:smallCaps w:val="false"/>
+          <w:color w:val="00000A"/>
+          <w:spacing w:val="0"/>
+          <w:sz w:val="24"/>
+          <w:szCs w:val="24"/>
+          <w:lang w:val="en-IN" w:eastAsia="zh-CN" w:bidi="hi-IN"/>
+        </w:rPr>
+      </w:r>
+    </w:p>
+    <w:p>
+      <w:pPr>
+        <w:pStyle w:val="Normal"/>
+        <w:rPr>
+          <w:rFonts w:eastAsia="Noto Sans CJK SC Regular" w:cs="FreeSans"/>
+          <w:b w:val="false"/>
+          <w:b w:val="false"/>
+          <w:i w:val="false"/>
+          <w:i w:val="false"/>
+          <w:caps w:val="false"/>
+          <w:smallCaps w:val="false"/>
+          <w:color w:val="00000A"/>
+          <w:spacing w:val="0"/>
+          <w:sz w:val="24"/>
+          <w:szCs w:val="24"/>
+          <w:lang w:val="en-IN" w:eastAsia="zh-CN" w:bidi="hi-IN"/>
+        </w:rPr>
+      </w:pPr>
+      <w:r>
+        <w:rPr>
+          <w:rFonts w:eastAsia="Noto Sans CJK SC Regular" w:cs="FreeSans"/>
+          <w:b w:val="false"/>
+          <w:i w:val="false"/>
+          <w:caps w:val="false"/>
+          <w:smallCaps w:val="false"/>
+          <w:color w:val="00000A"/>
+          <w:spacing w:val="0"/>
+          <w:sz w:val="24"/>
+          <w:szCs w:val="24"/>
+          <w:lang w:val="en-IN" w:eastAsia="zh-CN" w:bidi="hi-IN"/>
+        </w:rPr>
+      </w:r>
+    </w:p>
+    <w:p>
+      <w:pPr>
+        <w:pStyle w:val="Normal"/>
+        <w:rPr>
+          <w:rFonts w:eastAsia="Noto Sans CJK SC Regular" w:cs="FreeSans"/>
+          <w:b w:val="false"/>
+          <w:b w:val="false"/>
+          <w:i w:val="false"/>
+          <w:i w:val="false"/>
+          <w:caps w:val="false"/>
+          <w:smallCaps w:val="false"/>
+          <w:color w:val="00000A"/>
+          <w:spacing w:val="0"/>
+          <w:sz w:val="24"/>
+          <w:szCs w:val="24"/>
+          <w:lang w:val="en-IN" w:eastAsia="zh-CN" w:bidi="hi-IN"/>
+        </w:rPr>
+      </w:pPr>
+      <w:r>
+        <w:rPr>
+          <w:rFonts w:eastAsia="Noto Sans CJK SC Regular" w:cs="FreeSans"/>
+          <w:b w:val="false"/>
+          <w:i w:val="false"/>
+          <w:caps w:val="false"/>
+          <w:smallCaps w:val="false"/>
+          <w:color w:val="00000A"/>
+          <w:spacing w:val="0"/>
+          <w:sz w:val="24"/>
+          <w:szCs w:val="24"/>
+          <w:lang w:val="en-IN" w:eastAsia="zh-CN" w:bidi="hi-IN"/>
+        </w:rPr>
       </w:r>
     </w:p>
     <w:p>

</xml_diff>